<commit_message>
Updated Exp_5 and Exp_3_doc
</commit_message>
<xml_diff>
--- a/Experiment-05-Autopsy/Exp_5.docx
+++ b/Experiment-05-Autopsy/Exp_5.docx
@@ -70,14 +70,6 @@
     <w:p>
       <w:pPr>
         <w:spacing w:line="360" w:lineRule="auto"/>
-        <w:rPr>
-          <w:rFonts w:ascii="Times New Roman" w:hAnsi="Times New Roman" w:cs="Times New Roman"/>
-        </w:rPr>
-      </w:pPr>
-    </w:p>
-    <w:p>
-      <w:pPr>
-        <w:spacing w:line="360" w:lineRule="auto"/>
         <w:jc w:val="center"/>
         <w:rPr>
           <w:rFonts w:ascii="Times New Roman" w:hAnsi="Times New Roman" w:cs="Times New Roman"/>
@@ -367,6 +359,15 @@
         </w:rPr>
         <w:t xml:space="preserve"> (like File Type Identification, Keyword Searching, Timeline Analysis, and Hash Lookups) to process this evidence in the background, automatically categorizing artifacts such as web history, file system metadata, and communication records for the examiner to review.</w:t>
       </w:r>
+    </w:p>
+    <w:p>
+      <w:pPr>
+        <w:spacing w:line="360" w:lineRule="auto"/>
+        <w:jc w:val="both"/>
+        <w:rPr>
+          <w:rFonts w:ascii="Times New Roman" w:hAnsi="Times New Roman" w:cs="Times New Roman"/>
+        </w:rPr>
+      </w:pPr>
     </w:p>
     <w:p>
       <w:pPr>
@@ -1238,7 +1239,7 @@
         </w:rPr>
         <w:lastRenderedPageBreak/>
         <w:drawing>
-          <wp:inline distT="0" distB="0" distL="0" distR="0" wp14:anchorId="71669B12" wp14:editId="5D34C79D">
+          <wp:inline distT="0" distB="0" distL="0" distR="0" wp14:anchorId="71669B12" wp14:editId="718D591C">
             <wp:extent cx="5731510" cy="3043555"/>
             <wp:effectExtent l="0" t="0" r="2540" b="4445"/>
             <wp:docPr id="1157756820" name="Picture 5"/>
@@ -3394,6 +3395,7 @@
   <w:style w:type="character" w:default="1" w:styleId="DefaultParagraphFont">
     <w:name w:val="Default Paragraph Font"/>
     <w:uiPriority w:val="1"/>
+    <w:semiHidden/>
     <w:unhideWhenUsed/>
   </w:style>
   <w:style w:type="table" w:default="1" w:styleId="TableNormal">

</xml_diff>